<commit_message>
added tests + methods
</commit_message>
<xml_diff>
--- a/DevLog.docx
+++ b/DevLog.docx
@@ -66,21 +66,7 @@
         <w:rPr>
           <w:lang w:val="en-US"/>
         </w:rPr>
-        <w:t xml:space="preserve">git clone &lt;repository </w:t>
-      </w:r>
-      <w:proofErr w:type="spellStart"/>
-      <w:r>
-        <w:rPr>
-          <w:lang w:val="en-US"/>
-        </w:rPr>
-        <w:t>url</w:t>
-      </w:r>
-      <w:proofErr w:type="spellEnd"/>
-      <w:r>
-        <w:rPr>
-          <w:lang w:val="en-US"/>
-        </w:rPr>
-        <w:t xml:space="preserve"> http… or ssh&gt;to add repositories that already exist to your local system</w:t>
+        <w:t>git clone &lt;repository url http… or ssh&gt;to add repositories that already exist to your local system</w:t>
       </w:r>
     </w:p>
     <w:p>
@@ -98,21 +84,7 @@
         <w:rPr>
           <w:lang w:val="en-US"/>
         </w:rPr>
-        <w:t xml:space="preserve">git </w:t>
-      </w:r>
-      <w:proofErr w:type="spellStart"/>
-      <w:r>
-        <w:rPr>
-          <w:lang w:val="en-US"/>
-        </w:rPr>
-        <w:t>init</w:t>
-      </w:r>
-      <w:proofErr w:type="spellEnd"/>
-      <w:r>
-        <w:rPr>
-          <w:lang w:val="en-US"/>
-        </w:rPr>
-        <w:t xml:space="preserve"> in the folder you want to put your project or git init &lt;file path including your project&gt; to initialize yours</w:t>
+        <w:t>git init in the folder you want to put your project or git init &lt;file path including your project&gt; to initialize yours</w:t>
       </w:r>
     </w:p>
     <w:p>
@@ -197,21 +169,7 @@
         <w:rPr>
           <w:lang w:val="en-US"/>
         </w:rPr>
-        <w:t xml:space="preserve">double </w:t>
-      </w:r>
-      <w:proofErr w:type="spellStart"/>
-      <w:r>
-        <w:rPr>
-          <w:lang w:val="en-US"/>
-        </w:rPr>
-        <w:t>myNum</w:t>
-      </w:r>
-      <w:proofErr w:type="spellEnd"/>
-      <w:r>
-        <w:rPr>
-          <w:lang w:val="en-US"/>
-        </w:rPr>
-        <w:t xml:space="preserve"> = 9.87;</w:t>
+        <w:t>double myNum = 9.87;</w:t>
       </w:r>
     </w:p>
     <w:p>
@@ -229,35 +187,7 @@
         <w:rPr>
           <w:lang w:val="en-US"/>
         </w:rPr>
-        <w:t xml:space="preserve">int </w:t>
-      </w:r>
-      <w:proofErr w:type="spellStart"/>
-      <w:r>
-        <w:rPr>
-          <w:lang w:val="en-US"/>
-        </w:rPr>
-        <w:t>myNumInt</w:t>
-      </w:r>
-      <w:proofErr w:type="spellEnd"/>
-      <w:r>
-        <w:rPr>
-          <w:lang w:val="en-US"/>
-        </w:rPr>
-        <w:t xml:space="preserve"> = (int) </w:t>
-      </w:r>
-      <w:proofErr w:type="spellStart"/>
-      <w:r>
-        <w:rPr>
-          <w:lang w:val="en-US"/>
-        </w:rPr>
-        <w:t>myNum</w:t>
-      </w:r>
-      <w:proofErr w:type="spellEnd"/>
-      <w:r>
-        <w:rPr>
-          <w:lang w:val="en-US"/>
-        </w:rPr>
-        <w:t>;</w:t>
+        <w:t>int myNumInt = (int) myNum;</w:t>
       </w:r>
     </w:p>
     <w:p>
@@ -271,33 +201,11 @@
           <w:lang w:val="en-US"/>
         </w:rPr>
       </w:pPr>
-      <w:proofErr w:type="spellStart"/>
-      <w:r>
-        <w:rPr>
-          <w:lang w:val="en-US"/>
-        </w:rPr>
-        <w:t>System.out.println</w:t>
-      </w:r>
-      <w:proofErr w:type="spellEnd"/>
-      <w:r>
-        <w:rPr>
-          <w:lang w:val="en-US"/>
-        </w:rPr>
-        <w:t>(</w:t>
-      </w:r>
-      <w:proofErr w:type="spellStart"/>
-      <w:r>
-        <w:rPr>
-          <w:lang w:val="en-US"/>
-        </w:rPr>
-        <w:t>myNumInt</w:t>
-      </w:r>
-      <w:proofErr w:type="spellEnd"/>
-      <w:r>
-        <w:rPr>
-          <w:lang w:val="en-US"/>
-        </w:rPr>
-        <w:t>); = 9</w:t>
+      <w:r>
+        <w:rPr>
+          <w:lang w:val="en-US"/>
+        </w:rPr>
+        <w:t>System.out.println(myNumInt); = 9</w:t>
       </w:r>
     </w:p>
     <w:p>
@@ -353,21 +261,7 @@
         <w:rPr>
           <w:lang w:val="en-US"/>
         </w:rPr>
-        <w:t xml:space="preserve">int </w:t>
-      </w:r>
-      <w:proofErr w:type="spellStart"/>
-      <w:r>
-        <w:rPr>
-          <w:lang w:val="en-US"/>
-        </w:rPr>
-        <w:t>myInt</w:t>
-      </w:r>
-      <w:proofErr w:type="spellEnd"/>
-      <w:r>
-        <w:rPr>
-          <w:lang w:val="en-US"/>
-        </w:rPr>
-        <w:t xml:space="preserve"> = 9;</w:t>
+        <w:t>int myInt = 9;</w:t>
       </w:r>
     </w:p>
     <w:p>
@@ -385,35 +279,7 @@
         <w:rPr>
           <w:lang w:val="en-US"/>
         </w:rPr>
-        <w:t xml:space="preserve">double </w:t>
-      </w:r>
-      <w:proofErr w:type="spellStart"/>
-      <w:r>
-        <w:rPr>
-          <w:lang w:val="en-US"/>
-        </w:rPr>
-        <w:t>myDouble</w:t>
-      </w:r>
-      <w:proofErr w:type="spellEnd"/>
-      <w:r>
-        <w:rPr>
-          <w:lang w:val="en-US"/>
-        </w:rPr>
-        <w:t xml:space="preserve"> = </w:t>
-      </w:r>
-      <w:proofErr w:type="spellStart"/>
-      <w:r>
-        <w:rPr>
-          <w:lang w:val="en-US"/>
-        </w:rPr>
-        <w:t>myInt</w:t>
-      </w:r>
-      <w:proofErr w:type="spellEnd"/>
-      <w:r>
-        <w:rPr>
-          <w:lang w:val="en-US"/>
-        </w:rPr>
-        <w:t>;</w:t>
+        <w:t>double myDouble = myInt;</w:t>
       </w:r>
     </w:p>
     <w:p>
@@ -427,39 +293,11 @@
           <w:lang w:val="en-US"/>
         </w:rPr>
       </w:pPr>
-      <w:proofErr w:type="spellStart"/>
-      <w:r>
-        <w:rPr>
-          <w:lang w:val="en-US"/>
-        </w:rPr>
-        <w:t>System.out.println</w:t>
-      </w:r>
-      <w:proofErr w:type="spellEnd"/>
-      <w:r>
-        <w:rPr>
-          <w:lang w:val="en-US"/>
-        </w:rPr>
-        <w:t>(</w:t>
-      </w:r>
-      <w:proofErr w:type="spellStart"/>
-      <w:r>
-        <w:rPr>
-          <w:lang w:val="en-US"/>
-        </w:rPr>
-        <w:t>myDouble</w:t>
-      </w:r>
-      <w:proofErr w:type="spellEnd"/>
-      <w:r>
-        <w:rPr>
-          <w:lang w:val="en-US"/>
-        </w:rPr>
-        <w:t>); = 9</w:t>
-      </w:r>
-      <w:r>
-        <w:rPr>
-          <w:lang w:val="en-US"/>
-        </w:rPr>
-        <w:t>.0</w:t>
+      <w:r>
+        <w:rPr>
+          <w:lang w:val="en-US"/>
+        </w:rPr>
+        <w:t>System.out.println(myDouble); = 9.0</w:t>
       </w:r>
     </w:p>
     <w:p>
@@ -477,21 +315,7 @@
         <w:rPr>
           <w:lang w:val="en-US"/>
         </w:rPr>
-        <w:t xml:space="preserve">python -m </w:t>
-      </w:r>
-      <w:proofErr w:type="spellStart"/>
-      <w:r>
-        <w:rPr>
-          <w:lang w:val="en-US"/>
-        </w:rPr>
-        <w:t>venv</w:t>
-      </w:r>
-      <w:proofErr w:type="spellEnd"/>
-      <w:r>
-        <w:rPr>
-          <w:lang w:val="en-US"/>
-        </w:rPr>
-        <w:t xml:space="preserve">  &lt;project name&gt; to create a python environment basically where you can set the python version and dependencies (libraries – stuff that aren’t part of your code maybe external you can make use of) for just this project so it doesn’t get mixed up</w:t>
+        <w:t>python -m venv  &lt;project name&gt; to create a python environment basically where you can set the python version and dependencies (libraries – stuff that aren’t part of your code maybe external you can make use of) for just this project so it doesn’t get mixed up</w:t>
       </w:r>
     </w:p>
     <w:p>
@@ -509,21 +333,7 @@
         <w:rPr>
           <w:lang w:val="en-US"/>
         </w:rPr>
-        <w:t>&lt;</w:t>
-      </w:r>
-      <w:proofErr w:type="spellStart"/>
-      <w:r>
-        <w:rPr>
-          <w:lang w:val="en-US"/>
-        </w:rPr>
-        <w:t>projectname</w:t>
-      </w:r>
-      <w:proofErr w:type="spellEnd"/>
-      <w:r>
-        <w:rPr>
-          <w:lang w:val="en-US"/>
-        </w:rPr>
-        <w:t xml:space="preserve">&gt;\Scripts\activate to activate it </w:t>
+        <w:t xml:space="preserve">&lt;projectname&gt;\Scripts\activate to activate it </w:t>
       </w:r>
     </w:p>
     <w:p>
@@ -559,21 +369,7 @@
         <w:rPr>
           <w:lang w:val="en-US"/>
         </w:rPr>
-        <w:t>&lt;</w:t>
-      </w:r>
-      <w:proofErr w:type="spellStart"/>
-      <w:r>
-        <w:rPr>
-          <w:lang w:val="en-US"/>
-        </w:rPr>
-        <w:t>projectname</w:t>
-      </w:r>
-      <w:proofErr w:type="spellEnd"/>
-      <w:r>
-        <w:rPr>
-          <w:lang w:val="en-US"/>
-        </w:rPr>
-        <w:t>&gt; C:\users\&lt;username&gt;&gt;</w:t>
+        <w:t>&lt;projectname&gt; C:\users\&lt;username&gt;&gt;</w:t>
       </w:r>
     </w:p>
     <w:p>
@@ -738,21 +534,7 @@
         <w:rPr>
           <w:lang w:val="en-US"/>
         </w:rPr>
-        <w:t xml:space="preserve">For </w:t>
-      </w:r>
-      <w:proofErr w:type="spellStart"/>
-      <w:r>
-        <w:rPr>
-          <w:lang w:val="en-US"/>
-        </w:rPr>
-        <w:t>CSharp</w:t>
-      </w:r>
-      <w:proofErr w:type="spellEnd"/>
-      <w:r>
-        <w:rPr>
-          <w:lang w:val="en-US"/>
-        </w:rPr>
-        <w:t xml:space="preserve"> you can define variables and let them be dynamically assigned to a type using ‘var’ or define and assign them a variable when created</w:t>
+        <w:t>For CSharp you can define variables and let them be dynamically assigned to a type using ‘var’ or define and assign them a variable when created</w:t>
       </w:r>
     </w:p>
     <w:p>
@@ -830,21 +612,7 @@
         <w:rPr>
           <w:lang w:val="en-US"/>
         </w:rPr>
-        <w:t xml:space="preserve">While </w:t>
-      </w:r>
-      <w:proofErr w:type="spellStart"/>
-      <w:r>
-        <w:rPr>
-          <w:lang w:val="en-US"/>
-        </w:rPr>
-        <w:t>claude</w:t>
-      </w:r>
-      <w:proofErr w:type="spellEnd"/>
-      <w:r>
-        <w:rPr>
-          <w:lang w:val="en-US"/>
-        </w:rPr>
-        <w:t xml:space="preserve"> is answering/thinking about a question you can use /btw to ask it a side question without interrupting its current process</w:t>
+        <w:t>While claude is answering/thinking about a question you can use /btw to ask it a side question without interrupting its current process</w:t>
       </w:r>
       <w:r>
         <w:rPr>
@@ -903,6 +671,270 @@
           <w:lang w:val="en-US"/>
         </w:rPr>
       </w:pPr>
+      <w:r>
+        <w:rPr>
+          <w:lang w:val="en-US"/>
+        </w:rPr>
+        <w:t>Day 5:</w:t>
+      </w:r>
+    </w:p>
+    <w:p>
+      <w:pPr>
+        <w:pStyle w:val="ListParagraph"/>
+        <w:numPr>
+          <w:ilvl w:val="0"/>
+          <w:numId w:val="2"/>
+        </w:numPr>
+        <w:rPr>
+          <w:lang w:val="en-US"/>
+        </w:rPr>
+      </w:pPr>
+      <w:r>
+        <w:rPr>
+          <w:lang w:val="en-US"/>
+        </w:rPr>
+        <w:t>Test fixture: all the preparations needed to run a test such as creating temporary databases, directories or starting a server process</w:t>
+      </w:r>
+    </w:p>
+    <w:p>
+      <w:pPr>
+        <w:pStyle w:val="ListParagraph"/>
+        <w:numPr>
+          <w:ilvl w:val="0"/>
+          <w:numId w:val="2"/>
+        </w:numPr>
+        <w:rPr>
+          <w:lang w:val="en-US"/>
+        </w:rPr>
+      </w:pPr>
+      <w:r>
+        <w:rPr>
+          <w:lang w:val="en-US"/>
+        </w:rPr>
+        <w:t>Test case: a piece of code that’s checks for a certain response to a given number of inputs</w:t>
+      </w:r>
+      <w:r>
+        <w:rPr>
+          <w:lang w:val="en-US"/>
+        </w:rPr>
+        <w:t>.</w:t>
+      </w:r>
+    </w:p>
+    <w:p>
+      <w:pPr>
+        <w:pStyle w:val="ListParagraph"/>
+        <w:numPr>
+          <w:ilvl w:val="0"/>
+          <w:numId w:val="2"/>
+        </w:numPr>
+        <w:rPr>
+          <w:lang w:val="en-US"/>
+        </w:rPr>
+      </w:pPr>
+      <w:r>
+        <w:rPr>
+          <w:lang w:val="en-US"/>
+        </w:rPr>
+        <w:t>Test suite: a collection of test cases or test suites. Used to aggregate tests that should be executed together.</w:t>
+      </w:r>
+    </w:p>
+    <w:p>
+      <w:pPr>
+        <w:pStyle w:val="ListParagraph"/>
+        <w:numPr>
+          <w:ilvl w:val="0"/>
+          <w:numId w:val="2"/>
+        </w:numPr>
+        <w:rPr>
+          <w:lang w:val="en-US"/>
+        </w:rPr>
+      </w:pPr>
+      <w:r>
+        <w:rPr>
+          <w:lang w:val="en-US"/>
+        </w:rPr>
+        <w:t>Test runner: Orchestrates the execution of a test and returns the outcome to the users.</w:t>
+      </w:r>
+    </w:p>
+    <w:p>
+      <w:pPr>
+        <w:pStyle w:val="ListParagraph"/>
+        <w:numPr>
+          <w:ilvl w:val="0"/>
+          <w:numId w:val="2"/>
+        </w:numPr>
+        <w:rPr>
+          <w:lang w:val="en-US"/>
+        </w:rPr>
+      </w:pPr>
+      <w:r>
+        <w:rPr>
+          <w:lang w:val="en-US"/>
+        </w:rPr>
+        <w:t xml:space="preserve">To test in pytest you need to </w:t>
+      </w:r>
+      <w:r>
+        <w:rPr>
+          <w:lang w:val="en-US"/>
+        </w:rPr>
+        <w:t>‘</w:t>
+      </w:r>
+      <w:r>
+        <w:rPr>
+          <w:lang w:val="en-US"/>
+        </w:rPr>
+        <w:t>pip install -</w:t>
+      </w:r>
+      <w:r>
+        <w:rPr>
+          <w:lang w:val="en-US"/>
+        </w:rPr>
+        <w:t xml:space="preserve">U </w:t>
+      </w:r>
+      <w:r>
+        <w:rPr>
+          <w:lang w:val="en-US"/>
+        </w:rPr>
+        <w:t>pytest</w:t>
+      </w:r>
+      <w:r>
+        <w:rPr>
+          <w:lang w:val="en-US"/>
+        </w:rPr>
+        <w:t>’</w:t>
+      </w:r>
+    </w:p>
+    <w:p>
+      <w:pPr>
+        <w:pStyle w:val="ListParagraph"/>
+        <w:numPr>
+          <w:ilvl w:val="0"/>
+          <w:numId w:val="2"/>
+        </w:numPr>
+        <w:rPr>
+          <w:lang w:val="en-US"/>
+        </w:rPr>
+      </w:pPr>
+      <w:r>
+        <w:rPr>
+          <w:lang w:val="en-US"/>
+        </w:rPr>
+        <w:t>pytest would run all files in the format test_*.py or *_test.py</w:t>
+      </w:r>
+      <w:r>
+        <w:rPr>
+          <w:lang w:val="en-US"/>
+        </w:rPr>
+        <w:t xml:space="preserve"> in current directory and its subdirectories</w:t>
+      </w:r>
+    </w:p>
+    <w:p>
+      <w:pPr>
+        <w:pStyle w:val="ListParagraph"/>
+        <w:numPr>
+          <w:ilvl w:val="0"/>
+          <w:numId w:val="2"/>
+        </w:numPr>
+        <w:rPr>
+          <w:lang w:val="en-US"/>
+        </w:rPr>
+      </w:pPr>
+      <w:r>
+        <w:rPr>
+          <w:lang w:val="en-US"/>
+        </w:rPr>
+        <w:t>pytest -q &lt;test file name&gt; runs your code quietly producing less information on it.</w:t>
+      </w:r>
+    </w:p>
+    <w:p>
+      <w:pPr>
+        <w:pStyle w:val="ListParagraph"/>
+        <w:numPr>
+          <w:ilvl w:val="0"/>
+          <w:numId w:val="2"/>
+        </w:numPr>
+        <w:rPr>
+          <w:lang w:val="en-US"/>
+        </w:rPr>
+      </w:pPr>
+      <w:r>
+        <w:rPr>
+          <w:lang w:val="en-US"/>
+        </w:rPr>
+        <w:t xml:space="preserve">To change system environment variables from powershell </w:t>
+      </w:r>
+    </w:p>
+    <w:p>
+      <w:pPr>
+        <w:pStyle w:val="ListParagraph"/>
+        <w:numPr>
+          <w:ilvl w:val="1"/>
+          <w:numId w:val="2"/>
+        </w:numPr>
+        <w:rPr>
+          <w:lang w:val="en-US"/>
+        </w:rPr>
+      </w:pPr>
+      <w:r>
+        <w:rPr>
+          <w:lang w:val="en-US"/>
+        </w:rPr>
+        <w:t xml:space="preserve">run as administrator then </w:t>
+      </w:r>
+    </w:p>
+    <w:p>
+      <w:pPr>
+        <w:pStyle w:val="ListParagraph"/>
+        <w:numPr>
+          <w:ilvl w:val="1"/>
+          <w:numId w:val="2"/>
+        </w:numPr>
+        <w:rPr>
+          <w:lang w:val="en-US"/>
+        </w:rPr>
+      </w:pPr>
+      <w:r>
+        <w:rPr>
+          <w:lang w:val="en-US"/>
+        </w:rPr>
+        <w:t>[System.Environment]::SetEnvironmentVariable("JAVA_HOME", "C:\Program Files\Microsoft\jdk-21.0.11.10-hotspot", "Machine")</w:t>
+      </w:r>
+    </w:p>
+    <w:p>
+      <w:pPr>
+        <w:pStyle w:val="ListParagraph"/>
+        <w:numPr>
+          <w:ilvl w:val="0"/>
+          <w:numId w:val="2"/>
+        </w:numPr>
+        <w:rPr>
+          <w:lang w:val="en-US"/>
+        </w:rPr>
+      </w:pPr>
+      <w:r>
+        <w:rPr>
+          <w:lang w:val="en-US"/>
+        </w:rPr>
+        <w:t>dotnet test to run test in CSharp</w:t>
+      </w:r>
+    </w:p>
+    <w:p>
+      <w:pPr>
+        <w:pStyle w:val="ListParagraph"/>
+        <w:numPr>
+          <w:ilvl w:val="0"/>
+          <w:numId w:val="2"/>
+        </w:numPr>
+        <w:rPr>
+          <w:lang w:val="en-US"/>
+        </w:rPr>
+      </w:pPr>
+      <w:r>
+        <w:rPr>
+          <w:lang w:val="en-US"/>
+        </w:rPr>
+        <w:t>Difference between function can exist on its own can be called from anywhere and work while method has to be attached to something whether is be a class or an object and it cannot be called on its own.</w:t>
+      </w:r>
     </w:p>
     <w:p>
       <w:pPr>
@@ -930,9 +962,9 @@
 <file path=word/numbering.xml><?xml version="1.0" encoding="utf-8"?>
 <w:numbering xmlns:wpc="http://schemas.microsoft.com/office/word/2010/wordprocessingCanvas" xmlns:cx="http://schemas.microsoft.com/office/drawing/2014/chartex" xmlns:cx1="http://schemas.microsoft.com/office/drawing/2015/9/8/chartex" xmlns:cx2="http://schemas.microsoft.com/office/drawing/2015/10/21/chartex" xmlns:cx3="http://schemas.microsoft.com/office/drawing/2016/5/9/chartex" xmlns:cx4="http://schemas.microsoft.com/office/drawing/2016/5/10/chartex" xmlns:cx5="http://schemas.microsoft.com/office/drawing/2016/5/11/chartex" xmlns:cx6="http://schemas.microsoft.com/office/drawing/2016/5/12/chartex" xmlns:cx7="http://schemas.microsoft.com/office/drawing/2016/5/13/chartex" xmlns:cx8="http://schemas.microsoft.com/office/drawing/2016/5/14/chartex" xmlns:mc="http://schemas.openxmlformats.org/markup-compatibility/2006" xmlns:aink="http://schemas.microsoft.com/office/drawing/2016/ink" xmlns:am3d="http://schemas.microsoft.com/office/drawing/2017/model3d" xmlns:o="urn:schemas-microsoft-com:office:office" xmlns:oel="http://schemas.microsoft.com/office/2019/extlst" xmlns:r="http://schemas.openxmlformats.org/officeDocument/2006/relationships" xmlns:m="http://schemas.openxmlformats.org/officeDocument/2006/math" xmlns:v="urn:schemas-microsoft-com:vml" xmlns:wp14="http://schemas.microsoft.com/office/word/2010/wordprocessingDrawing" xmlns:wp="http://schemas.openxmlformats.org/drawingml/2006/wordprocessingDrawing" xmlns:w10="urn:schemas-microsoft-com:office:word" xmlns:w="http://schemas.openxmlformats.org/wordprocessingml/2006/main" xmlns:w14="http://schemas.microsoft.com/office/word/2010/wordml" xmlns:w15="http://schemas.microsoft.com/office/word/2012/wordml" xmlns:w16cex="http://schemas.microsoft.com/office/word/2018/wordml/cex" xmlns:w16cid="http://schemas.microsoft.com/office/word/2016/wordml/cid" xmlns:w16="http://schemas.microsoft.com/office/word/2018/wordml" xmlns:w16du="http://schemas.microsoft.com/office/word/2023/wordml/word16du" xmlns:w16sdtdh="http://schemas.microsoft.com/office/word/2020/wordml/sdtdatahash" xmlns:w16sdtfl="http://schemas.microsoft.com/office/word/2024/wordml/sdtformatlock" xmlns:w16se="http://schemas.microsoft.com/office/word/2015/wordml/symex" xmlns:wpg="http://schemas.microsoft.com/office/word/2010/wordprocessingGroup" xmlns:wpi="http://schemas.microsoft.com/office/word/2010/wordprocessingInk" xmlns:wne="http://schemas.microsoft.com/office/word/2006/wordml" xmlns:wps="http://schemas.microsoft.com/office/word/2010/wordprocessingShape" mc:Ignorable="w14 w15 w16se w16cid w16 w16cex w16sdtdh w16sdtfl w16du wp14">
   <w:abstractNum w:abstractNumId="0" w15:restartNumberingAfterBreak="0">
-    <w:nsid w:val="660B0BC7"/>
+    <w:nsid w:val="4E8B73F5"/>
     <w:multiLevelType w:val="hybridMultilevel"/>
-    <w:tmpl w:val="7F426734"/>
+    <w:tmpl w:val="B37E9D9A"/>
     <w:lvl w:ilvl="0" w:tplc="08090003">
       <w:start w:val="1"/>
       <w:numFmt w:val="bullet"/>
@@ -1029,6 +1061,119 @@
         <w:rFonts w:ascii="Courier New" w:hAnsi="Courier New" w:cs="Courier New" w:hint="default"/>
       </w:rPr>
     </w:lvl>
+    <w:lvl w:ilvl="8" w:tplc="08090005" w:tentative="1">
+      <w:start w:val="1"/>
+      <w:numFmt w:val="bullet"/>
+      <w:lvlText w:val=""/>
+      <w:lvlJc w:val="left"/>
+      <w:pPr>
+        <w:ind w:left="6480" w:hanging="360"/>
+      </w:pPr>
+      <w:rPr>
+        <w:rFonts w:ascii="Wingdings" w:hAnsi="Wingdings" w:hint="default"/>
+      </w:rPr>
+    </w:lvl>
+  </w:abstractNum>
+  <w:abstractNum w:abstractNumId="1" w15:restartNumberingAfterBreak="0">
+    <w:nsid w:val="660B0BC7"/>
+    <w:multiLevelType w:val="hybridMultilevel"/>
+    <w:tmpl w:val="7F426734"/>
+    <w:lvl w:ilvl="0" w:tplc="08090003">
+      <w:start w:val="1"/>
+      <w:numFmt w:val="bullet"/>
+      <w:lvlText w:val="o"/>
+      <w:lvlJc w:val="left"/>
+      <w:pPr>
+        <w:ind w:left="720" w:hanging="360"/>
+      </w:pPr>
+      <w:rPr>
+        <w:rFonts w:ascii="Courier New" w:hAnsi="Courier New" w:cs="Courier New" w:hint="default"/>
+      </w:rPr>
+    </w:lvl>
+    <w:lvl w:ilvl="1" w:tplc="08090003">
+      <w:start w:val="1"/>
+      <w:numFmt w:val="bullet"/>
+      <w:lvlText w:val="o"/>
+      <w:lvlJc w:val="left"/>
+      <w:pPr>
+        <w:ind w:left="1440" w:hanging="360"/>
+      </w:pPr>
+      <w:rPr>
+        <w:rFonts w:ascii="Courier New" w:hAnsi="Courier New" w:cs="Courier New" w:hint="default"/>
+      </w:rPr>
+    </w:lvl>
+    <w:lvl w:ilvl="2" w:tplc="08090005" w:tentative="1">
+      <w:start w:val="1"/>
+      <w:numFmt w:val="bullet"/>
+      <w:lvlText w:val=""/>
+      <w:lvlJc w:val="left"/>
+      <w:pPr>
+        <w:ind w:left="2160" w:hanging="360"/>
+      </w:pPr>
+      <w:rPr>
+        <w:rFonts w:ascii="Wingdings" w:hAnsi="Wingdings" w:hint="default"/>
+      </w:rPr>
+    </w:lvl>
+    <w:lvl w:ilvl="3" w:tplc="08090001" w:tentative="1">
+      <w:start w:val="1"/>
+      <w:numFmt w:val="bullet"/>
+      <w:lvlText w:val=""/>
+      <w:lvlJc w:val="left"/>
+      <w:pPr>
+        <w:ind w:left="2880" w:hanging="360"/>
+      </w:pPr>
+      <w:rPr>
+        <w:rFonts w:ascii="Symbol" w:hAnsi="Symbol" w:hint="default"/>
+      </w:rPr>
+    </w:lvl>
+    <w:lvl w:ilvl="4" w:tplc="08090003" w:tentative="1">
+      <w:start w:val="1"/>
+      <w:numFmt w:val="bullet"/>
+      <w:lvlText w:val="o"/>
+      <w:lvlJc w:val="left"/>
+      <w:pPr>
+        <w:ind w:left="3600" w:hanging="360"/>
+      </w:pPr>
+      <w:rPr>
+        <w:rFonts w:ascii="Courier New" w:hAnsi="Courier New" w:cs="Courier New" w:hint="default"/>
+      </w:rPr>
+    </w:lvl>
+    <w:lvl w:ilvl="5" w:tplc="08090005" w:tentative="1">
+      <w:start w:val="1"/>
+      <w:numFmt w:val="bullet"/>
+      <w:lvlText w:val=""/>
+      <w:lvlJc w:val="left"/>
+      <w:pPr>
+        <w:ind w:left="4320" w:hanging="360"/>
+      </w:pPr>
+      <w:rPr>
+        <w:rFonts w:ascii="Wingdings" w:hAnsi="Wingdings" w:hint="default"/>
+      </w:rPr>
+    </w:lvl>
+    <w:lvl w:ilvl="6" w:tplc="08090001" w:tentative="1">
+      <w:start w:val="1"/>
+      <w:numFmt w:val="bullet"/>
+      <w:lvlText w:val=""/>
+      <w:lvlJc w:val="left"/>
+      <w:pPr>
+        <w:ind w:left="5040" w:hanging="360"/>
+      </w:pPr>
+      <w:rPr>
+        <w:rFonts w:ascii="Symbol" w:hAnsi="Symbol" w:hint="default"/>
+      </w:rPr>
+    </w:lvl>
+    <w:lvl w:ilvl="7" w:tplc="08090003" w:tentative="1">
+      <w:start w:val="1"/>
+      <w:numFmt w:val="bullet"/>
+      <w:lvlText w:val="o"/>
+      <w:lvlJc w:val="left"/>
+      <w:pPr>
+        <w:ind w:left="5760" w:hanging="360"/>
+      </w:pPr>
+      <w:rPr>
+        <w:rFonts w:ascii="Courier New" w:hAnsi="Courier New" w:cs="Courier New" w:hint="default"/>
+      </w:rPr>
+    </w:lvl>
     <w:lvl w:ilvl="8" w:tplc="08090005">
       <w:start w:val="1"/>
       <w:numFmt w:val="bullet"/>
@@ -1043,6 +1188,9 @@
     </w:lvl>
   </w:abstractNum>
   <w:num w:numId="1" w16cid:durableId="1148787128">
+    <w:abstractNumId w:val="1"/>
+  </w:num>
+  <w:num w:numId="2" w16cid:durableId="1274509325">
     <w:abstractNumId w:val="0"/>
   </w:num>
 </w:numbering>

</xml_diff>

<commit_message>
arrays + lists + string methods
</commit_message>
<xml_diff>
--- a/DevLog.docx
+++ b/DevLog.docx
@@ -934,6 +934,140 @@
           <w:lang w:val="en-US"/>
         </w:rPr>
         <w:t>Difference between function can exist on its own can be called from anywhere and work while method has to be attached to something whether is be a class or an object and it cannot be called on its own.</w:t>
+      </w:r>
+    </w:p>
+    <w:p>
+      <w:pPr>
+        <w:rPr>
+          <w:lang w:val="en-US"/>
+        </w:rPr>
+      </w:pPr>
+      <w:r>
+        <w:rPr>
+          <w:lang w:val="en-US"/>
+        </w:rPr>
+        <w:t>Day 6:</w:t>
+      </w:r>
+    </w:p>
+    <w:p>
+      <w:pPr>
+        <w:pStyle w:val="ListParagraph"/>
+        <w:numPr>
+          <w:ilvl w:val="0"/>
+          <w:numId w:val="3"/>
+        </w:numPr>
+        <w:rPr>
+          <w:lang w:val="en-US"/>
+        </w:rPr>
+      </w:pPr>
+      <w:r>
+        <w:rPr>
+          <w:lang w:val="en-US"/>
+        </w:rPr>
+        <w:lastRenderedPageBreak/>
+        <w:t>Difference between list and array is list size can dynamically change while arrays can’t.</w:t>
+      </w:r>
+    </w:p>
+    <w:p>
+      <w:pPr>
+        <w:pStyle w:val="ListParagraph"/>
+        <w:numPr>
+          <w:ilvl w:val="0"/>
+          <w:numId w:val="3"/>
+        </w:numPr>
+        <w:rPr>
+          <w:lang w:val="en-US"/>
+        </w:rPr>
+      </w:pPr>
+      <w:r>
+        <w:rPr>
+          <w:lang w:val="en-US"/>
+        </w:rPr>
+        <w:t>Python list_variable.insert(</w:t>
+      </w:r>
+      <w:r>
+        <w:rPr>
+          <w:lang w:val="en-US"/>
+        </w:rPr>
+        <w:t>index</w:t>
+      </w:r>
+      <w:r>
+        <w:rPr>
+          <w:lang w:val="en-US"/>
+        </w:rPr>
+        <w:t xml:space="preserve">, </w:t>
+      </w:r>
+      <w:r>
+        <w:rPr>
+          <w:lang w:val="en-US"/>
+        </w:rPr>
+        <w:t>item</w:t>
+      </w:r>
+      <w:r>
+        <w:rPr>
+          <w:lang w:val="en-US"/>
+        </w:rPr>
+        <w:t>)</w:t>
+      </w:r>
+    </w:p>
+    <w:p>
+      <w:pPr>
+        <w:pStyle w:val="ListParagraph"/>
+        <w:numPr>
+          <w:ilvl w:val="0"/>
+          <w:numId w:val="3"/>
+        </w:numPr>
+        <w:rPr>
+          <w:lang w:val="en-US"/>
+        </w:rPr>
+      </w:pPr>
+      <w:r>
+        <w:rPr>
+          <w:lang w:val="en-US"/>
+        </w:rPr>
+        <w:t>When creating tuples in python with only one item you have to add a comma if not python will not recognize it as a tuple</w:t>
+      </w:r>
+    </w:p>
+    <w:p>
+      <w:pPr>
+        <w:pStyle w:val="ListParagraph"/>
+        <w:numPr>
+          <w:ilvl w:val="1"/>
+          <w:numId w:val="3"/>
+        </w:numPr>
+        <w:rPr>
+          <w:lang w:val="en-US"/>
+        </w:rPr>
+      </w:pPr>
+      <w:r>
+        <w:rPr>
+          <w:lang w:val="en-US"/>
+        </w:rPr>
+        <w:t>myTuple = (“apple”,) NOT (“apple</w:t>
+      </w:r>
+      <w:r>
+        <w:rPr>
+          <w:lang w:val="en-US"/>
+        </w:rPr>
+        <w:t>”)</w:t>
+      </w:r>
+    </w:p>
+    <w:p>
+      <w:pPr>
+        <w:pStyle w:val="ListParagraph"/>
+        <w:numPr>
+          <w:ilvl w:val="0"/>
+          <w:numId w:val="3"/>
+        </w:numPr>
+        <w:rPr>
+          <w:lang w:val="en-US"/>
+        </w:rPr>
+      </w:pPr>
+      <w:r>
+        <w:rPr>
+          <w:lang w:val="en-US"/>
+        </w:rPr>
+        <w:t>Tuples can have multiple data types</w:t>
       </w:r>
     </w:p>
     <w:p>
@@ -962,6 +1096,119 @@
 <file path=word/numbering.xml><?xml version="1.0" encoding="utf-8"?>
 <w:numbering xmlns:wpc="http://schemas.microsoft.com/office/word/2010/wordprocessingCanvas" xmlns:cx="http://schemas.microsoft.com/office/drawing/2014/chartex" xmlns:cx1="http://schemas.microsoft.com/office/drawing/2015/9/8/chartex" xmlns:cx2="http://schemas.microsoft.com/office/drawing/2015/10/21/chartex" xmlns:cx3="http://schemas.microsoft.com/office/drawing/2016/5/9/chartex" xmlns:cx4="http://schemas.microsoft.com/office/drawing/2016/5/10/chartex" xmlns:cx5="http://schemas.microsoft.com/office/drawing/2016/5/11/chartex" xmlns:cx6="http://schemas.microsoft.com/office/drawing/2016/5/12/chartex" xmlns:cx7="http://schemas.microsoft.com/office/drawing/2016/5/13/chartex" xmlns:cx8="http://schemas.microsoft.com/office/drawing/2016/5/14/chartex" xmlns:mc="http://schemas.openxmlformats.org/markup-compatibility/2006" xmlns:aink="http://schemas.microsoft.com/office/drawing/2016/ink" xmlns:am3d="http://schemas.microsoft.com/office/drawing/2017/model3d" xmlns:o="urn:schemas-microsoft-com:office:office" xmlns:oel="http://schemas.microsoft.com/office/2019/extlst" xmlns:r="http://schemas.openxmlformats.org/officeDocument/2006/relationships" xmlns:m="http://schemas.openxmlformats.org/officeDocument/2006/math" xmlns:v="urn:schemas-microsoft-com:vml" xmlns:wp14="http://schemas.microsoft.com/office/word/2010/wordprocessingDrawing" xmlns:wp="http://schemas.openxmlformats.org/drawingml/2006/wordprocessingDrawing" xmlns:w10="urn:schemas-microsoft-com:office:word" xmlns:w="http://schemas.openxmlformats.org/wordprocessingml/2006/main" xmlns:w14="http://schemas.microsoft.com/office/word/2010/wordml" xmlns:w15="http://schemas.microsoft.com/office/word/2012/wordml" xmlns:w16cex="http://schemas.microsoft.com/office/word/2018/wordml/cex" xmlns:w16cid="http://schemas.microsoft.com/office/word/2016/wordml/cid" xmlns:w16="http://schemas.microsoft.com/office/word/2018/wordml" xmlns:w16du="http://schemas.microsoft.com/office/word/2023/wordml/word16du" xmlns:w16sdtdh="http://schemas.microsoft.com/office/word/2020/wordml/sdtdatahash" xmlns:w16sdtfl="http://schemas.microsoft.com/office/word/2024/wordml/sdtformatlock" xmlns:w16se="http://schemas.microsoft.com/office/word/2015/wordml/symex" xmlns:wpg="http://schemas.microsoft.com/office/word/2010/wordprocessingGroup" xmlns:wpi="http://schemas.microsoft.com/office/word/2010/wordprocessingInk" xmlns:wne="http://schemas.microsoft.com/office/word/2006/wordml" xmlns:wps="http://schemas.microsoft.com/office/word/2010/wordprocessingShape" mc:Ignorable="w14 w15 w16se w16cid w16 w16cex w16sdtdh w16sdtfl w16du wp14">
   <w:abstractNum w:abstractNumId="0" w15:restartNumberingAfterBreak="0">
+    <w:nsid w:val="09C202D5"/>
+    <w:multiLevelType w:val="hybridMultilevel"/>
+    <w:tmpl w:val="8820ADEC"/>
+    <w:lvl w:ilvl="0" w:tplc="08090003">
+      <w:start w:val="1"/>
+      <w:numFmt w:val="bullet"/>
+      <w:lvlText w:val="o"/>
+      <w:lvlJc w:val="left"/>
+      <w:pPr>
+        <w:ind w:left="720" w:hanging="360"/>
+      </w:pPr>
+      <w:rPr>
+        <w:rFonts w:ascii="Courier New" w:hAnsi="Courier New" w:cs="Courier New" w:hint="default"/>
+      </w:rPr>
+    </w:lvl>
+    <w:lvl w:ilvl="1" w:tplc="08090003">
+      <w:start w:val="1"/>
+      <w:numFmt w:val="bullet"/>
+      <w:lvlText w:val="o"/>
+      <w:lvlJc w:val="left"/>
+      <w:pPr>
+        <w:ind w:left="1440" w:hanging="360"/>
+      </w:pPr>
+      <w:rPr>
+        <w:rFonts w:ascii="Courier New" w:hAnsi="Courier New" w:cs="Courier New" w:hint="default"/>
+      </w:rPr>
+    </w:lvl>
+    <w:lvl w:ilvl="2" w:tplc="08090005" w:tentative="1">
+      <w:start w:val="1"/>
+      <w:numFmt w:val="bullet"/>
+      <w:lvlText w:val=""/>
+      <w:lvlJc w:val="left"/>
+      <w:pPr>
+        <w:ind w:left="2160" w:hanging="360"/>
+      </w:pPr>
+      <w:rPr>
+        <w:rFonts w:ascii="Wingdings" w:hAnsi="Wingdings" w:hint="default"/>
+      </w:rPr>
+    </w:lvl>
+    <w:lvl w:ilvl="3" w:tplc="08090001" w:tentative="1">
+      <w:start w:val="1"/>
+      <w:numFmt w:val="bullet"/>
+      <w:lvlText w:val=""/>
+      <w:lvlJc w:val="left"/>
+      <w:pPr>
+        <w:ind w:left="2880" w:hanging="360"/>
+      </w:pPr>
+      <w:rPr>
+        <w:rFonts w:ascii="Symbol" w:hAnsi="Symbol" w:hint="default"/>
+      </w:rPr>
+    </w:lvl>
+    <w:lvl w:ilvl="4" w:tplc="08090003" w:tentative="1">
+      <w:start w:val="1"/>
+      <w:numFmt w:val="bullet"/>
+      <w:lvlText w:val="o"/>
+      <w:lvlJc w:val="left"/>
+      <w:pPr>
+        <w:ind w:left="3600" w:hanging="360"/>
+      </w:pPr>
+      <w:rPr>
+        <w:rFonts w:ascii="Courier New" w:hAnsi="Courier New" w:cs="Courier New" w:hint="default"/>
+      </w:rPr>
+    </w:lvl>
+    <w:lvl w:ilvl="5" w:tplc="08090005" w:tentative="1">
+      <w:start w:val="1"/>
+      <w:numFmt w:val="bullet"/>
+      <w:lvlText w:val=""/>
+      <w:lvlJc w:val="left"/>
+      <w:pPr>
+        <w:ind w:left="4320" w:hanging="360"/>
+      </w:pPr>
+      <w:rPr>
+        <w:rFonts w:ascii="Wingdings" w:hAnsi="Wingdings" w:hint="default"/>
+      </w:rPr>
+    </w:lvl>
+    <w:lvl w:ilvl="6" w:tplc="08090001" w:tentative="1">
+      <w:start w:val="1"/>
+      <w:numFmt w:val="bullet"/>
+      <w:lvlText w:val=""/>
+      <w:lvlJc w:val="left"/>
+      <w:pPr>
+        <w:ind w:left="5040" w:hanging="360"/>
+      </w:pPr>
+      <w:rPr>
+        <w:rFonts w:ascii="Symbol" w:hAnsi="Symbol" w:hint="default"/>
+      </w:rPr>
+    </w:lvl>
+    <w:lvl w:ilvl="7" w:tplc="08090003" w:tentative="1">
+      <w:start w:val="1"/>
+      <w:numFmt w:val="bullet"/>
+      <w:lvlText w:val="o"/>
+      <w:lvlJc w:val="left"/>
+      <w:pPr>
+        <w:ind w:left="5760" w:hanging="360"/>
+      </w:pPr>
+      <w:rPr>
+        <w:rFonts w:ascii="Courier New" w:hAnsi="Courier New" w:cs="Courier New" w:hint="default"/>
+      </w:rPr>
+    </w:lvl>
+    <w:lvl w:ilvl="8" w:tplc="08090005" w:tentative="1">
+      <w:start w:val="1"/>
+      <w:numFmt w:val="bullet"/>
+      <w:lvlText w:val=""/>
+      <w:lvlJc w:val="left"/>
+      <w:pPr>
+        <w:ind w:left="6480" w:hanging="360"/>
+      </w:pPr>
+      <w:rPr>
+        <w:rFonts w:ascii="Wingdings" w:hAnsi="Wingdings" w:hint="default"/>
+      </w:rPr>
+    </w:lvl>
+  </w:abstractNum>
+  <w:abstractNum w:abstractNumId="1" w15:restartNumberingAfterBreak="0">
     <w:nsid w:val="4E8B73F5"/>
     <w:multiLevelType w:val="hybridMultilevel"/>
     <w:tmpl w:val="B37E9D9A"/>
@@ -1074,7 +1321,7 @@
       </w:rPr>
     </w:lvl>
   </w:abstractNum>
-  <w:abstractNum w:abstractNumId="1" w15:restartNumberingAfterBreak="0">
+  <w:abstractNum w:abstractNumId="2" w15:restartNumberingAfterBreak="0">
     <w:nsid w:val="660B0BC7"/>
     <w:multiLevelType w:val="hybridMultilevel"/>
     <w:tmpl w:val="7F426734"/>
@@ -1188,9 +1435,12 @@
     </w:lvl>
   </w:abstractNum>
   <w:num w:numId="1" w16cid:durableId="1148787128">
+    <w:abstractNumId w:val="2"/>
+  </w:num>
+  <w:num w:numId="2" w16cid:durableId="1274509325">
     <w:abstractNumId w:val="1"/>
   </w:num>
-  <w:num w:numId="2" w16cid:durableId="1274509325">
+  <w:num w:numId="3" w16cid:durableId="1264073781">
     <w:abstractNumId w:val="0"/>
   </w:num>
 </w:numbering>

</xml_diff>